<commit_message>
feat(hito2): incorporate professor feedback - migrate uml classes to annex, add level 1 functional blocks to logical view, fix bpmn arrows in proceso 01, remove internal canvas titles, and update docx to v01.10
</commit_message>
<xml_diff>
--- a/02_FASE_1_ARQUITECTURA_GENERICA_Y_PATRONES/Entregable_02_Arquitectura_Especifica/VISTA_DE_PROCESOS/Vista de Procesos v01.00.docx
+++ b/02_FASE_1_ARQUITECTURA_GENERICA_Y_PATRONES/Entregable_02_Arquitectura_Especifica/VISTA_DE_PROCESOS/Vista de Procesos v01.00.docx
@@ -384,7 +384,7 @@
                 <w:color w:val="0F2942"/>
                 <w:sz w:val="22"/>
               </w:rPr>
-              <w:t>VERSIÓN V01.00</w:t>
+              <w:t>VERSIÓN V01.10</w:t>
             </w:r>
           </w:p>
         </w:tc>
@@ -1412,6 +1412,113 @@
           </w:p>
         </w:tc>
       </w:tr>
+      <w:tr>
+        <w:tc>
+          <w:tcPr>
+            <w:tcW w:type="dxa" w:w="1560"/>
+          </w:tcPr>
+          <w:p>
+            <w:pPr>
+              <w:spacing w:before="60" w:after="60"/>
+              <w:jc w:val="center"/>
+            </w:pPr>
+            <w:r/>
+            <w:r>
+              <w:rPr>
+                <w:rFonts w:ascii="Arial" w:hAnsi="Arial"/>
+                <w:b/>
+                <w:color w:val="1E293B"/>
+                <w:sz w:val="17"/>
+              </w:rPr>
+              <w:t>22/10/2026</w:t>
+            </w:r>
+          </w:p>
+        </w:tc>
+        <w:tc>
+          <w:tcPr>
+            <w:tcW w:type="dxa" w:w="5528"/>
+          </w:tcPr>
+          <w:p>
+            <w:pPr>
+              <w:spacing w:before="60" w:after="60"/>
+              <w:jc w:val="left"/>
+            </w:pPr>
+            <w:r/>
+            <w:r>
+              <w:rPr>
+                <w:rFonts w:ascii="Arial" w:hAnsi="Arial"/>
+                <w:b w:val="0"/>
+                <w:color w:val="1E293B"/>
+                <w:sz w:val="17"/>
+              </w:rPr>
+              <w:t>Recomendación del M.Sc. Percy Huertas Niquén: Subsanar la discontinuidad gráfica y flechas cortadas observadas en el Proceso 01 (ILA-0017) en los saltos de Paso 1 a Paso 2 (Admisión), Paso 2 a Paso 3 (Backend), conexión vertical de excepción XOR 1 a Notificar Conflicto y salida de Meet API. Eliminar encabezados internos duplicados en canvas.</w:t>
+            </w:r>
+          </w:p>
+        </w:tc>
+        <w:tc>
+          <w:tcPr>
+            <w:tcW w:type="dxa" w:w="1134"/>
+          </w:tcPr>
+          <w:p>
+            <w:pPr>
+              <w:spacing w:before="60" w:after="60"/>
+              <w:jc w:val="center"/>
+            </w:pPr>
+            <w:r/>
+            <w:r>
+              <w:rPr>
+                <w:rFonts w:ascii="Arial" w:hAnsi="Arial"/>
+                <w:b/>
+                <w:color w:val="1E293B"/>
+                <w:sz w:val="17"/>
+              </w:rPr>
+              <w:t>v01.10</w:t>
+            </w:r>
+          </w:p>
+        </w:tc>
+        <w:tc>
+          <w:tcPr>
+            <w:tcW w:type="dxa" w:w="992"/>
+          </w:tcPr>
+          <w:p>
+            <w:pPr>
+              <w:spacing w:before="60" w:after="60"/>
+              <w:jc w:val="center"/>
+            </w:pPr>
+            <w:r/>
+            <w:r>
+              <w:rPr>
+                <w:rFonts w:ascii="Arial" w:hAnsi="Arial"/>
+                <w:b w:val="0"/>
+                <w:color w:val="1E293B"/>
+                <w:sz w:val="17"/>
+              </w:rPr>
+              <w:t>20</w:t>
+            </w:r>
+          </w:p>
+        </w:tc>
+        <w:tc>
+          <w:tcPr>
+            <w:tcW w:type="dxa" w:w="992"/>
+          </w:tcPr>
+          <w:p>
+            <w:pPr>
+              <w:spacing w:before="60" w:after="60"/>
+              <w:jc w:val="center"/>
+            </w:pPr>
+            <w:r/>
+            <w:r>
+              <w:rPr>
+                <w:rFonts w:ascii="Arial" w:hAnsi="Arial"/>
+                <w:b w:val="0"/>
+                <w:color w:val="1E293B"/>
+                <w:sz w:val="17"/>
+              </w:rPr>
+              <w:t>Aprobado</w:t>
+            </w:r>
+          </w:p>
+        </w:tc>
+      </w:tr>
     </w:tbl>
     <w:p>
       <w:pPr>
@@ -1847,6 +1954,92 @@
         <w:tc>
           <w:tcPr>
             <w:tcW w:w="2410" w:type="dxa"/>
+          </w:tcPr>
+          <w:p>
+            <w:pPr>
+              <w:spacing w:before="60" w:after="60"/>
+              <w:jc w:val="left"/>
+            </w:pPr>
+            <w:r/>
+            <w:r>
+              <w:rPr>
+                <w:rFonts w:ascii="Arial" w:hAnsi="Arial"/>
+                <w:b w:val="0"/>
+                <w:color w:val="1E293B"/>
+                <w:sz w:val="17"/>
+              </w:rPr>
+              <w:t>Marquez H. Marco (Líder) y Equipo RuwayLabs</w:t>
+            </w:r>
+          </w:p>
+        </w:tc>
+      </w:tr>
+      <w:tr>
+        <w:tc>
+          <w:tcPr>
+            <w:tcW w:type="dxa" w:w="1272"/>
+          </w:tcPr>
+          <w:p>
+            <w:pPr>
+              <w:spacing w:before="60" w:after="60"/>
+              <w:jc w:val="center"/>
+            </w:pPr>
+            <w:r/>
+            <w:r>
+              <w:rPr>
+                <w:rFonts w:ascii="Arial" w:hAnsi="Arial"/>
+                <w:b/>
+                <w:color w:val="1E293B"/>
+                <w:sz w:val="17"/>
+              </w:rPr>
+              <w:t>22/10/2026</w:t>
+            </w:r>
+          </w:p>
+        </w:tc>
+        <w:tc>
+          <w:tcPr>
+            <w:tcW w:type="dxa" w:w="1034"/>
+          </w:tcPr>
+          <w:p>
+            <w:pPr>
+              <w:spacing w:before="60" w:after="60"/>
+              <w:jc w:val="center"/>
+            </w:pPr>
+            <w:r/>
+            <w:r>
+              <w:rPr>
+                <w:rFonts w:ascii="Arial" w:hAnsi="Arial"/>
+                <w:b/>
+                <w:color w:val="1E293B"/>
+                <w:sz w:val="17"/>
+              </w:rPr>
+              <w:t>v01.10</w:t>
+            </w:r>
+          </w:p>
+        </w:tc>
+        <w:tc>
+          <w:tcPr>
+            <w:tcW w:type="dxa" w:w="5349"/>
+          </w:tcPr>
+          <w:p>
+            <w:pPr>
+              <w:spacing w:before="60" w:after="60"/>
+              <w:jc w:val="left"/>
+            </w:pPr>
+            <w:r/>
+            <w:r>
+              <w:rPr>
+                <w:rFonts w:ascii="Arial" w:hAnsi="Arial"/>
+                <w:b w:val="0"/>
+                <w:color w:val="1E293B"/>
+                <w:sz w:val="17"/>
+              </w:rPr>
+              <w:t>Corrección geométrica integral de conectores BPMN en Proceso 01 (ILA-0017): reubicación de Tarea 2 y caja de excepción, alineación milimétrica de paths SVG (cero flechas cortadas), adición de evento fin de cancelación, remoción de títulos internos en canvas y actualización a versión v01.10.</w:t>
+            </w:r>
+          </w:p>
+        </w:tc>
+        <w:tc>
+          <w:tcPr>
+            <w:tcW w:type="dxa" w:w="2410"/>
           </w:tcPr>
           <w:p>
             <w:pPr>
@@ -7504,7 +7697,7 @@
       <w:r>
         <w:drawing>
           <wp:inline xmlns:a="http://schemas.openxmlformats.org/drawingml/2006/main" xmlns:pic="http://schemas.openxmlformats.org/drawingml/2006/picture">
-            <wp:extent cx="5760720" cy="3476716"/>
+            <wp:extent cx="5760720" cy="3237362"/>
             <wp:docPr id="2" name="Picture 2"/>
             <wp:cNvGraphicFramePr>
               <a:graphicFrameLocks noChangeAspect="1"/>
@@ -7525,7 +7718,7 @@
                   <pic:spPr>
                     <a:xfrm>
                       <a:off x="0" y="0"/>
-                      <a:ext cx="5760720" cy="3476716"/>
+                      <a:ext cx="5760720" cy="3237362"/>
                     </a:xfrm>
                     <a:prstGeom prst="rect"/>
                   </pic:spPr>
@@ -8696,7 +8889,7 @@
       <w:r>
         <w:drawing>
           <wp:inline xmlns:a="http://schemas.openxmlformats.org/drawingml/2006/main" xmlns:pic="http://schemas.openxmlformats.org/drawingml/2006/picture">
-            <wp:extent cx="5760720" cy="3188632"/>
+            <wp:extent cx="5760720" cy="2956010"/>
             <wp:docPr id="3" name="Picture 3"/>
             <wp:cNvGraphicFramePr>
               <a:graphicFrameLocks noChangeAspect="1"/>
@@ -8717,7 +8910,7 @@
                   <pic:spPr>
                     <a:xfrm>
                       <a:off x="0" y="0"/>
-                      <a:ext cx="5760720" cy="3188632"/>
+                      <a:ext cx="5760720" cy="2956010"/>
                     </a:xfrm>
                     <a:prstGeom prst="rect"/>
                   </pic:spPr>
@@ -9798,7 +9991,7 @@
       <w:r>
         <w:drawing>
           <wp:inline xmlns:a="http://schemas.openxmlformats.org/drawingml/2006/main" xmlns:pic="http://schemas.openxmlformats.org/drawingml/2006/picture">
-            <wp:extent cx="5760720" cy="3171611"/>
+            <wp:extent cx="5760720" cy="2931424"/>
             <wp:docPr id="4" name="Picture 4"/>
             <wp:cNvGraphicFramePr>
               <a:graphicFrameLocks noChangeAspect="1"/>
@@ -9819,7 +10012,7 @@
                   <pic:spPr>
                     <a:xfrm>
                       <a:off x="0" y="0"/>
-                      <a:ext cx="5760720" cy="3171611"/>
+                      <a:ext cx="5760720" cy="2931424"/>
                     </a:xfrm>
                     <a:prstGeom prst="rect"/>
                   </pic:spPr>
@@ -12374,6 +12567,96 @@
                 <w:sz w:val="17"/>
               </w:rPr>
               <w:t>Consolidación final aprobada para entrega del Hito 2, verificada paso a paso contra Artefacto_Ilación_v02.00.docx.</w:t>
+            </w:r>
+          </w:p>
+        </w:tc>
+      </w:tr>
+      <w:tr>
+        <w:tc>
+          <w:tcPr>
+            <w:tcW w:type="dxa" w:w="1152"/>
+            <w:shd w:val="clear" w:color="auto" w:fill="F8FAFC"/>
+          </w:tcPr>
+          <w:p>
+            <w:pPr>
+              <w:spacing w:before="60" w:after="60"/>
+              <w:jc w:val="center"/>
+            </w:pPr>
+            <w:r/>
+            <w:r>
+              <w:rPr>
+                <w:rFonts w:ascii="Arial" w:hAnsi="Arial"/>
+                <w:b/>
+                <w:color w:val="0F2942"/>
+                <w:sz w:val="17"/>
+              </w:rPr>
+              <w:t>v01.10</w:t>
+            </w:r>
+          </w:p>
+        </w:tc>
+        <w:tc>
+          <w:tcPr>
+            <w:tcW w:type="dxa" w:w="1440"/>
+            <w:shd w:val="clear" w:color="auto" w:fill="F8FAFC"/>
+          </w:tcPr>
+          <w:p>
+            <w:pPr>
+              <w:spacing w:before="60" w:after="60"/>
+              <w:jc w:val="left"/>
+            </w:pPr>
+            <w:r/>
+            <w:r>
+              <w:rPr>
+                <w:rFonts w:ascii="Arial" w:hAnsi="Arial"/>
+                <w:b w:val="0"/>
+                <w:color w:val="1E293B"/>
+                <w:sz w:val="17"/>
+              </w:rPr>
+              <w:t>22/10/2026</w:t>
+            </w:r>
+          </w:p>
+        </w:tc>
+        <w:tc>
+          <w:tcPr>
+            <w:tcW w:type="dxa" w:w="2592"/>
+            <w:shd w:val="clear" w:color="auto" w:fill="F8FAFC"/>
+          </w:tcPr>
+          <w:p>
+            <w:pPr>
+              <w:spacing w:before="60" w:after="60"/>
+              <w:jc w:val="left"/>
+            </w:pPr>
+            <w:r/>
+            <w:r>
+              <w:rPr>
+                <w:rFonts w:ascii="Arial" w:hAnsi="Arial"/>
+                <w:b w:val="0"/>
+                <w:color w:val="1E293B"/>
+                <w:sz w:val="17"/>
+              </w:rPr>
+              <w:t>Marquez H. Marco (Líder) y Equipo RuwayLabs</w:t>
+            </w:r>
+          </w:p>
+        </w:tc>
+        <w:tc>
+          <w:tcPr>
+            <w:tcW w:type="dxa" w:w="4032"/>
+            <w:shd w:val="clear" w:color="auto" w:fill="F8FAFC"/>
+          </w:tcPr>
+          <w:p>
+            <w:pPr>
+              <w:spacing w:before="60" w:after="60"/>
+              <w:jc w:val="left"/>
+            </w:pPr>
+            <w:r/>
+            <w:r>
+              <w:rPr>
+                <w:rFonts w:ascii="Arial" w:hAnsi="Arial"/>
+                <w:b w:val="0"/>
+                <w:color w:val="1E293B"/>
+                <w:sz w:val="17"/>
+              </w:rPr>
+              <w:t>Corrección geométrica de conectores en Proceso 01 (ILA-0017): reubicación de Tarea 2 y caja de excepción, alineación de paths SVG (cero flechas cortadas), adición de evento fin de cancelación y remoción de títulos internos en canvas.</w:t>
             </w:r>
           </w:p>
         </w:tc>

</xml_diff>